<commit_message>
Speaker script: memory-vs-discount framing for alpha and delta
Slide 8 now explains the two dials in plain language — alpha = how long the
strategy's memory is (calm anchor vs chasing the last few days), delta = how
big a discount it demands before buying (hair trigger vs picky), plus the
one-liner and the interaction; slide 11's winner description echoes the
same vocabulary.

Co-Authored-By: Claude Fable 5 <noreply@anthropic.com>
</commit_message>
<xml_diff>
--- a/slides/Speaker_Script.docx
+++ b/slides/Speaker_Script.docx
@@ -534,7 +534,19 @@
           <w:sz w:val="24"/>
           <w:szCs w:val="24"/>
         </w:rPr>
-        <w:t xml:space="preserve">The strategy family is deliberately simple. Keep an exponential moving average of the price — that's the fair-value estimate. When today's price sits more than delta below that average, buy one unit and hold to settlement. Alpha controls the memory of the average; delta controls how big a dip has to be before you call it a mispricing instead of a wiggle. We test a full three-by-three grid of alpha and delta, against two benchmarks: buy-and-hold — the “market is right” position — and never-trade, which is the sanity floor at exactly zero.</w:t>
+        <w:t xml:space="preserve">The strategy family is deliberately simple, and it has exactly two dials. The first is alpha, the smoothing — think of it as how long the strategy's MEMORY is. It keeps a running estimate of fair value built from past prices; small alpha means a long memory — a calm, stable anchor that barely reacts to any single day — while big alpha means it mostly remembers the last two or three days and chases the latest price. The second dial is delta, the entry threshold — how big a DISCOUNT the strategy demands before it buys. Small delta is a hair trigger: any two-cent dip below the estimate and it's in. Big delta is picky: it waits for a full ten-cent dip — roughly a two-sigma event at our noise level — before calling it a real mispricing rather than wiggle.</w:t>
+      </w:r>
+    </w:p>
+    <w:p>
+      <w:pPr>
+        <w:spacing w:after="180" w:line="300"/>
+      </w:pPr>
+      <w:r>
+        <w:rPr>
+          <w:sz w:val="24"/>
+          <w:szCs w:val="24"/>
+        </w:rPr>
+        <w:t xml:space="preserve">One-liner to remember: alpha is how long the memory is; delta is how big a discount it demands before buying. And the two interact, because the dip is measured AGAINST the smoothed estimate: with fast smoothing the estimate hugs the price so tightly that a ten-cent gap almost never opens — which is why one corner of our grid basically never trades. We test the full three-by-three grid of alpha and delta, against two benchmarks: buy-and-hold — the “market is right” position — and never-trade, the sanity floor at exactly zero.</w:t>
       </w:r>
     </w:p>
     <w:p>
@@ -709,7 +721,7 @@
           <w:sz w:val="24"/>
           <w:szCs w:val="24"/>
         </w:rPr>
-        <w:t xml:space="preserve">The winner's character is patience in both dials: a long-memory estimate, and a trigger that only fires on roughly two-sigma dips — the dips most likely to be genuine mispricing. And notice the corner cell — fast smoothing with a wide threshold — that one almost never trades: a fast average hugs the price so closely that a ten-cent gap never opens. The two dials interact.</w:t>
+        <w:t xml:space="preserve">The winner's character is patience on both dials: the longest memory in the grid, and the biggest discount demanded — it only acts on roughly two-sigma dips, the ones most likely to be genuine mispricing rather than wiggle. And notice the corner cell — short memory with a big discount demanded — that one almost never trades: a fast average hugs the price so closely that a ten-cent gap never opens. Memory and discount interact.</w:t>
       </w:r>
     </w:p>
     <w:p>

</xml_diff>